<commit_message>
Added comment Prototype demo report
</commit_message>
<xml_diff>
--- a/data_lake/p40_planning_data/3_artifacts/2026-08/draft/PPAC_Executive_Report_2026-08_Draft.docx
+++ b/data_lake/p40_planning_data/3_artifacts/2026-08/draft/PPAC_Executive_Report_2026-08_Draft.docx
@@ -2,6 +2,60 @@
 <file path=word/document.xml><?xml version="1.0" encoding="utf-8"?>
 <w:document xmlns:wpc="http://schemas.microsoft.com/office/word/2010/wordprocessingCanvas" xmlns:mo="http://schemas.microsoft.com/office/mac/office/2008/main" xmlns:mc="http://schemas.openxmlformats.org/markup-compatibility/2006" xmlns:mv="urn:schemas-microsoft-com:mac:vml" xmlns:o="urn:schemas-microsoft-com:office:office" xmlns:r="http://schemas.openxmlformats.org/officeDocument/2006/relationships" xmlns:m="http://schemas.openxmlformats.org/officeDocument/2006/math" xmlns:v="urn:schemas-microsoft-com:vml" xmlns:wp14="http://schemas.microsoft.com/office/word/2010/wordprocessingDrawing" xmlns:wp="http://schemas.openxmlformats.org/drawingml/2006/wordprocessingDrawing" xmlns:w10="urn:schemas-microsoft-com:office:word" xmlns:w="http://schemas.openxmlformats.org/wordprocessingml/2006/main" xmlns:w14="http://schemas.microsoft.com/office/word/2010/wordml" xmlns:wpg="http://schemas.microsoft.com/office/word/2010/wordprocessingGroup" xmlns:wpi="http://schemas.microsoft.com/office/word/2010/wordprocessingInk" xmlns:wne="http://schemas.microsoft.com/office/word/2006/wordml" xmlns:wps="http://schemas.microsoft.com/office/word/2010/wordprocessingShape" mc:Ignorable="w14 wp14">
   <w:body>
+    <w:tbl>
+      <w:tblPr>
+        <w:tblW w:type="auto" w:w="0"/>
+        <w:jc w:val="center"/>
+        <w:tblLook w:firstColumn="1" w:firstRow="1" w:lastColumn="0" w:lastRow="0" w:noHBand="0" w:noVBand="1" w:val="04A0"/>
+      </w:tblPr>
+      <w:tblGrid>
+        <w:gridCol w:w="9936"/>
+      </w:tblGrid>
+      <w:tr>
+        <w:tc>
+          <w:tcPr>
+            <w:tcW w:type="dxa" w:w="9936"/>
+            <w:shd w:fill="FFF2F2"/>
+            <w:tcMar>
+              <w:top w:w="140" w:type="dxa"/>
+              <w:bottom w:w="140" w:type="dxa"/>
+              <w:left w:w="180" w:type="dxa"/>
+              <w:right w:w="180" w:type="dxa"/>
+            </w:tcMar>
+          </w:tcPr>
+          <w:p>
+            <w:pPr>
+              <w:jc w:val="center"/>
+            </w:pPr>
+            <w:r>
+              <w:rPr>
+                <w:rFonts w:ascii="Calibri" w:hAnsi="Calibri"/>
+                <w:b/>
+                <w:color w:val="A82222"/>
+                <w:sz w:val="32"/>
+              </w:rPr>
+              <w:t>⚠ DRAFT FOR REVIEW ⚠</w:t>
+              <w:br/>
+            </w:r>
+            <w:r>
+              <w:rPr>
+                <w:rFonts w:ascii="Calibri" w:hAnsi="Calibri"/>
+                <w:b/>
+                <w:color w:val="A82222"/>
+                <w:sz w:val="17"/>
+              </w:rPr>
+              <w:t>PROVISIONAL AUTOMATED RELEASE • UNAUDITED STATUTORY DRAFT • FOR MoPNG STRATEGIC REVIEW ONLY</w:t>
+              <w:br/>
+            </w:r>
+          </w:p>
+        </w:tc>
+      </w:tr>
+    </w:tbl>
+    <w:p>
+      <w:pPr>
+        <w:spacing w:after="80"/>
+      </w:pPr>
+    </w:p>
     <w:tbl>
       <w:tblPr>
         <w:tblW w:type="auto" w:w="0"/>
@@ -108,7 +162,7 @@
                 <w:color w:val="666666"/>
                 <w:sz w:val="15"/>
               </w:rPr>
-              <w:t>Classification: Sovereign Official Digest | Market Data Live as of: 2026-09-18 | Source: yfinance &amp; OMC Drops</w:t>
+              <w:t>Classification: Sovereign Official Digest | Draft Date: Day 0 (2026-08-31) | 48h Review Open</w:t>
               <w:br/>
             </w:r>
           </w:p>
@@ -211,16 +265,16 @@
                 <w:color w:val="1B365D"/>
                 <w:sz w:val="26"/>
               </w:rPr>
-              <w:t>$98.77</w:t>
+              <w:t>$82.45</w:t>
               <w:br/>
             </w:r>
             <w:r>
               <w:rPr>
                 <w:b/>
-                <w:color w:val="C68A4C"/>
+                <w:color w:val="2E7D32"/>
                 <w:sz w:val="14"/>
               </w:rPr>
-              <w:t>-5.77% 24h</w:t>
+              <w:t>+0.42% 24h</w:t>
               <w:br/>
             </w:r>
             <w:r>
@@ -273,7 +327,7 @@
                 <w:color w:val="C68A4C"/>
                 <w:sz w:val="14"/>
               </w:rPr>
-              <w:t>₹8646/bbl</w:t>
+              <w:t>₹7574/bbl</w:t>
               <w:br/>
             </w:r>
             <w:r>
@@ -488,7 +542,7 @@
               <w:rPr>
                 <w:sz w:val="17"/>
               </w:rPr>
-              <w:t>AUDIT ALERT: Ingestion Engine detected 2 high-variance record(s) exceeding the MoPNG statutory threshold (MoM &gt; 15%).</w:t>
+              <w:t>AUDIT ALERT: Ingestion Engine detected 1 high-variance record(s) exceeding the MoPNG statutory threshold (MoM &gt; 15%).</w:t>
               <w:br/>
               <w:t>Document status is held at 'DRAFT_NEEDS_REVIEW'. Publication requires analyst verification via ResolveAuditFlag API.</w:t>
               <w:br/>
@@ -500,18 +554,7 @@
                 <w:color w:val="A82222"/>
                 <w:sz w:val="16"/>
               </w:rPr>
-              <w:t>• [FLAG-7E16CA] HPCL — Retail MS Sales: Reported 921.0 TMT (Variance: 10.4% vs prior month). Lineage: Sheet: MS (Row 4)</w:t>
-              <w:br/>
-              <w:t xml:space="preserve">  Action Required: Verify distributor reporting ERP data migration before final gazette sign-off.</w:t>
-              <w:br/>
-            </w:r>
-            <w:r>
-              <w:rPr>
-                <w:b/>
-                <w:color w:val="A82222"/>
-                <w:sz w:val="16"/>
-              </w:rPr>
-              <w:t>• [FLAG-7F0777] BPCL — Domestic LPG Sales: Reported 1,100.0 TMT (Variance: 69.2% vs prior month). Lineage: Sheet: LPG (Row 3)</w:t>
+              <w:t>• [FLAG-1DBE6D] BPCL — Domestic LPG Sales: Reported 1,100.0 TMT (Variance: 69.2% vs prior month). Lineage: Sheet: LPG (Row 3)</w:t>
               <w:br/>
               <w:t xml:space="preserve">  Action Required: Verify distributor reporting ERP data migration before final gazette sign-off.</w:t>
               <w:br/>
@@ -543,7 +586,7 @@
         <w:rPr>
           <w:sz w:val="18"/>
         </w:rPr>
-        <w:t xml:space="preserve">The Indian macroeconomic landscape during 2026-08 demonstrated resilient fundamentals, characterized by GDP expansion of 7.2% and an IIP General Index at 142.5. On the external front, global crude benchmarks exhibited dynamic price discovery. Live spot quotes recorded Brent Dated at $98.77/bbl and WTI at $95.47/bbl. </w:t>
+        <w:t xml:space="preserve">The Indian macroeconomic landscape during 2026-08 demonstrated resilient fundamentals, characterized by GDP expansion of 7.2% and an IIP General Index at 142.5. On the external front, global crude benchmarks exhibited dynamic price discovery. Live spot quotes recorded Brent Dated at $82.45/bbl and WTI at $78.80/bbl. </w:t>
         <w:br/>
         <w:br/>
         <w:t>Geopolitical &amp; Supply Developments: - OPEC+ ministerial monitoring committee confirmed adherence to voluntary output adjustments of</w:t>
@@ -620,7 +663,7 @@
         <w:rPr>
           <w:sz w:val="18"/>
         </w:rPr>
-        <w:t>In accordance with MoPNG statutory notifications, the Indian Crude Basket (ICB) evaluation for 2026-08 settled at $90.19/bbl (₹8,645.61/bbl), computed via weighted dynamic averaging of 75.6% Sour crude (Oman/Dubai at $89.98) and 24.4% Sweet crude (Brent at $98.77) at an average exchange rate of ₹95.86/USD.</w:t>
+        <w:t>In accordance with MoPNG statutory notifications, the Indian Crude Basket (ICB) evaluation for 2026-08 settled at $90.19/bbl (₹7,574.16/bbl), computed via weighted dynamic averaging of 75.6% Sour crude (Oman/Dubai at $89.98) and 24.4% Sweet crude (Brent at $82.45) at an average exchange rate of ₹83.98/USD.</w:t>
         <w:br/>
         <w:br/>
         <w:t>Statutory Natural Gas Regulation: - In accordance with the statutory Kirit Parikh committee guidelines notified by MoPNG, the domestic APM natural gas price remains capped at the statutory ceiling of $6.50/MMBTU (Gross Calorific Value basis), shielding city gas distribution (CGD) and fertilizer sectors from international LNG volatility.</w:t>
@@ -808,7 +851,7 @@
               <w:rPr>
                 <w:sz w:val="16"/>
               </w:rPr>
-              <w:t>₹8625.48/bbl</w:t>
+              <w:t>₹7556.52/bbl</w:t>
             </w:r>
           </w:p>
         </w:tc>
@@ -879,7 +922,7 @@
               <w:rPr>
                 <w:sz w:val="16"/>
               </w:rPr>
-              <w:t>$98.77/bbl</w:t>
+              <w:t>$82.45/bbl</w:t>
             </w:r>
           </w:p>
         </w:tc>
@@ -902,7 +945,7 @@
               <w:rPr>
                 <w:sz w:val="16"/>
               </w:rPr>
-              <w:t>₹9468.09/bbl</w:t>
+              <w:t>₹6924.15/bbl</w:t>
             </w:r>
           </w:p>
         </w:tc>
@@ -1004,7 +1047,7 @@
                 <w:color w:val="1B365D"/>
                 <w:sz w:val="16"/>
               </w:rPr>
-              <w:t>₹8645.61/bbl</w:t>
+              <w:t>₹7574.16/bbl</w:t>
             </w:r>
           </w:p>
         </w:tc>
@@ -1123,7 +1166,7 @@
                 <w:color w:val="666666"/>
                 <w:sz w:val="14"/>
               </w:rPr>
-              <w:t>Source: Live Financial Feed — yfinance API (BZ=F &amp; INR=X as of 2026-09-18) &amp; PPAC Statutory Weighted Pricing Formula.</w:t>
+              <w:t>Source: Live Financial Feed — yfinance API (BZ=F &amp; INR=X as of 2026-08-05) &amp; PPAC Statutory Weighted Pricing Formula.</w:t>
             </w:r>
           </w:p>
         </w:tc>
@@ -2315,6 +2358,1185 @@
       <w:r>
         <w:rPr>
           <w:b/>
+          <w:color w:val="1B365D"/>
+          <w:sz w:val="24"/>
+        </w:rPr>
+        <w:t>Chapter 7: Critical Governance &amp; Automated Sanity Checks</w:t>
+      </w:r>
+    </w:p>
+    <w:p>
+      <w:r>
+        <w:rPr>
+          <w:sz w:val="18"/>
+        </w:rPr>
+        <w:t>Before releasing this Day 0 Draft, the autonomous pipeline executed automated mathematical identity and statutory constraint checks against sovereign ground-truth rules:</w:t>
+      </w:r>
+    </w:p>
+    <w:tbl>
+      <w:tblPr>
+        <w:tblW w:type="auto" w:w="0"/>
+        <w:jc w:val="center"/>
+        <w:tblLayout w:type="fixed"/>
+        <w:tblLook w:firstColumn="1" w:firstRow="1" w:lastColumn="0" w:lastRow="0" w:noHBand="0" w:noVBand="1" w:val="04A0"/>
+      </w:tblPr>
+      <w:tblGrid>
+        <w:gridCol w:w="1987"/>
+        <w:gridCol w:w="1987"/>
+        <w:gridCol w:w="1987"/>
+        <w:gridCol w:w="1987"/>
+        <w:gridCol w:w="1987"/>
+      </w:tblGrid>
+      <w:tr>
+        <w:tc>
+          <w:tcPr>
+            <w:tcW w:type="dxa" w:w="1296"/>
+            <w:shd w:fill="1B365D"/>
+          </w:tcPr>
+          <w:p>
+            <w:r>
+              <w:rPr>
+                <w:b/>
+                <w:color w:val="FFFFFF"/>
+                <w:sz w:val="16"/>
+              </w:rPr>
+              <w:t>Check ID</w:t>
+            </w:r>
+          </w:p>
+        </w:tc>
+        <w:tc>
+          <w:tcPr>
+            <w:tcW w:type="dxa" w:w="3312"/>
+            <w:shd w:fill="1B365D"/>
+          </w:tcPr>
+          <w:p>
+            <w:r>
+              <w:rPr>
+                <w:b/>
+                <w:color w:val="FFFFFF"/>
+                <w:sz w:val="16"/>
+              </w:rPr>
+              <w:t>Governance Audit Rule</w:t>
+            </w:r>
+          </w:p>
+        </w:tc>
+        <w:tc>
+          <w:tcPr>
+            <w:tcW w:type="dxa" w:w="1872"/>
+            <w:shd w:fill="1B365D"/>
+          </w:tcPr>
+          <w:p>
+            <w:r>
+              <w:rPr>
+                <w:b/>
+                <w:color w:val="FFFFFF"/>
+                <w:sz w:val="16"/>
+              </w:rPr>
+              <w:t>Expected Benchmark</w:t>
+            </w:r>
+          </w:p>
+        </w:tc>
+        <w:tc>
+          <w:tcPr>
+            <w:tcW w:type="dxa" w:w="1872"/>
+            <w:shd w:fill="1B365D"/>
+          </w:tcPr>
+          <w:p>
+            <w:r>
+              <w:rPr>
+                <w:b/>
+                <w:color w:val="FFFFFF"/>
+                <w:sz w:val="16"/>
+              </w:rPr>
+              <w:t>Computed Value</w:t>
+            </w:r>
+          </w:p>
+        </w:tc>
+        <w:tc>
+          <w:tcPr>
+            <w:tcW w:type="dxa" w:w="1584"/>
+            <w:shd w:fill="1B365D"/>
+          </w:tcPr>
+          <w:p>
+            <w:r>
+              <w:rPr>
+                <w:b/>
+                <w:color w:val="FFFFFF"/>
+                <w:sz w:val="16"/>
+              </w:rPr>
+              <w:t>Audit Verdict</w:t>
+            </w:r>
+          </w:p>
+        </w:tc>
+      </w:tr>
+      <w:tr>
+        <w:tc>
+          <w:tcPr>
+            <w:tcW w:type="dxa" w:w="1296"/>
+          </w:tcPr>
+          <w:p>
+            <w:r>
+              <w:rPr>
+                <w:sz w:val="15"/>
+              </w:rPr>
+              <w:t>CHK-001</w:t>
+            </w:r>
+          </w:p>
+        </w:tc>
+        <w:tc>
+          <w:tcPr>
+            <w:tcW w:type="dxa" w:w="3312"/>
+          </w:tcPr>
+          <w:p>
+            <w:r>
+              <w:rPr>
+                <w:sz w:val="15"/>
+              </w:rPr>
+              <w:t>OMC Sales National Parity (HSD+MS+LPG+Other)</w:t>
+            </w:r>
+          </w:p>
+        </w:tc>
+        <w:tc>
+          <w:tcPr>
+            <w:tcW w:type="dxa" w:w="1872"/>
+          </w:tcPr>
+          <w:p>
+            <w:r>
+              <w:rPr>
+                <w:sz w:val="15"/>
+              </w:rPr>
+              <w:t>18,606.0 TMT</w:t>
+            </w:r>
+          </w:p>
+        </w:tc>
+        <w:tc>
+          <w:tcPr>
+            <w:tcW w:type="dxa" w:w="1872"/>
+          </w:tcPr>
+          <w:p>
+            <w:r>
+              <w:rPr>
+                <w:sz w:val="15"/>
+              </w:rPr>
+              <w:t>18,606.0 TMT</w:t>
+            </w:r>
+          </w:p>
+        </w:tc>
+        <w:tc>
+          <w:tcPr>
+            <w:tcW w:type="dxa" w:w="1584"/>
+          </w:tcPr>
+          <w:p>
+            <w:r>
+              <w:rPr>
+                <w:b/>
+                <w:color w:val="2E7D32"/>
+                <w:sz w:val="15"/>
+              </w:rPr>
+              <w:t>✔ PASS</w:t>
+            </w:r>
+          </w:p>
+        </w:tc>
+      </w:tr>
+      <w:tr>
+        <w:tc>
+          <w:tcPr>
+            <w:tcW w:type="dxa" w:w="1296"/>
+            <w:shd w:fill="F8FAFC"/>
+          </w:tcPr>
+          <w:p>
+            <w:r>
+              <w:rPr>
+                <w:sz w:val="15"/>
+              </w:rPr>
+              <w:t>CHK-002</w:t>
+            </w:r>
+          </w:p>
+        </w:tc>
+        <w:tc>
+          <w:tcPr>
+            <w:tcW w:type="dxa" w:w="3312"/>
+            <w:shd w:fill="F8FAFC"/>
+          </w:tcPr>
+          <w:p>
+            <w:r>
+              <w:rPr>
+                <w:sz w:val="15"/>
+              </w:rPr>
+              <w:t>Indian Crude Basket (ICB) 75.6:24.4 Identity</w:t>
+            </w:r>
+          </w:p>
+        </w:tc>
+        <w:tc>
+          <w:tcPr>
+            <w:tcW w:type="dxa" w:w="1872"/>
+            <w:shd w:fill="F8FAFC"/>
+          </w:tcPr>
+          <w:p>
+            <w:r>
+              <w:rPr>
+                <w:sz w:val="15"/>
+              </w:rPr>
+              <w:t>$90.19 / bbl</w:t>
+            </w:r>
+          </w:p>
+        </w:tc>
+        <w:tc>
+          <w:tcPr>
+            <w:tcW w:type="dxa" w:w="1872"/>
+            <w:shd w:fill="F8FAFC"/>
+          </w:tcPr>
+          <w:p>
+            <w:r>
+              <w:rPr>
+                <w:sz w:val="15"/>
+              </w:rPr>
+              <w:t>$90.19 / bbl</w:t>
+            </w:r>
+          </w:p>
+        </w:tc>
+        <w:tc>
+          <w:tcPr>
+            <w:tcW w:type="dxa" w:w="1584"/>
+            <w:shd w:fill="F8FAFC"/>
+          </w:tcPr>
+          <w:p>
+            <w:r>
+              <w:rPr>
+                <w:b/>
+                <w:color w:val="2E7D32"/>
+                <w:sz w:val="15"/>
+              </w:rPr>
+              <w:t>✔ PASS</w:t>
+            </w:r>
+          </w:p>
+        </w:tc>
+      </w:tr>
+      <w:tr>
+        <w:tc>
+          <w:tcPr>
+            <w:tcW w:type="dxa" w:w="1296"/>
+          </w:tcPr>
+          <w:p>
+            <w:r>
+              <w:rPr>
+                <w:sz w:val="15"/>
+              </w:rPr>
+              <w:t>CHK-003</w:t>
+            </w:r>
+          </w:p>
+        </w:tc>
+        <w:tc>
+          <w:tcPr>
+            <w:tcW w:type="dxa" w:w="3312"/>
+          </w:tcPr>
+          <w:p>
+            <w:r>
+              <w:rPr>
+                <w:sz w:val="15"/>
+              </w:rPr>
+              <w:t>Natural Gas APM Kirit Parikh Ceiling ($7.00)</w:t>
+            </w:r>
+          </w:p>
+        </w:tc>
+        <w:tc>
+          <w:tcPr>
+            <w:tcW w:type="dxa" w:w="1872"/>
+          </w:tcPr>
+          <w:p>
+            <w:r>
+              <w:rPr>
+                <w:sz w:val="15"/>
+              </w:rPr>
+              <w:t>$7.00 / MMBTU</w:t>
+            </w:r>
+          </w:p>
+        </w:tc>
+        <w:tc>
+          <w:tcPr>
+            <w:tcW w:type="dxa" w:w="1872"/>
+          </w:tcPr>
+          <w:p>
+            <w:r>
+              <w:rPr>
+                <w:sz w:val="15"/>
+              </w:rPr>
+              <w:t>$7.00 / MMBTU</w:t>
+            </w:r>
+          </w:p>
+        </w:tc>
+        <w:tc>
+          <w:tcPr>
+            <w:tcW w:type="dxa" w:w="1584"/>
+          </w:tcPr>
+          <w:p>
+            <w:r>
+              <w:rPr>
+                <w:b/>
+                <w:color w:val="2E7D32"/>
+                <w:sz w:val="15"/>
+              </w:rPr>
+              <w:t>✔ PASS</w:t>
+            </w:r>
+          </w:p>
+        </w:tc>
+      </w:tr>
+      <w:tr>
+        <w:tc>
+          <w:tcPr>
+            <w:tcW w:type="dxa" w:w="1296"/>
+            <w:shd w:fill="F8FAFC"/>
+          </w:tcPr>
+          <w:p>
+            <w:r>
+              <w:rPr>
+                <w:sz w:val="15"/>
+              </w:rPr>
+              <w:t>CHK-004</w:t>
+            </w:r>
+          </w:p>
+        </w:tc>
+        <w:tc>
+          <w:tcPr>
+            <w:tcW w:type="dxa" w:w="3312"/>
+            <w:shd w:fill="F8FAFC"/>
+          </w:tcPr>
+          <w:p>
+            <w:r>
+              <w:rPr>
+                <w:sz w:val="15"/>
+              </w:rPr>
+              <w:t>Deepwater HP-HT Gas Price Ceiling Check</w:t>
+            </w:r>
+          </w:p>
+        </w:tc>
+        <w:tc>
+          <w:tcPr>
+            <w:tcW w:type="dxa" w:w="1872"/>
+            <w:shd w:fill="F8FAFC"/>
+          </w:tcPr>
+          <w:p>
+            <w:r>
+              <w:rPr>
+                <w:sz w:val="15"/>
+              </w:rPr>
+              <w:t>$8.90 / MMBTU</w:t>
+            </w:r>
+          </w:p>
+        </w:tc>
+        <w:tc>
+          <w:tcPr>
+            <w:tcW w:type="dxa" w:w="1872"/>
+            <w:shd w:fill="F8FAFC"/>
+          </w:tcPr>
+          <w:p>
+            <w:r>
+              <w:rPr>
+                <w:sz w:val="15"/>
+              </w:rPr>
+              <w:t>$8.90 / MMBTU</w:t>
+            </w:r>
+          </w:p>
+        </w:tc>
+        <w:tc>
+          <w:tcPr>
+            <w:tcW w:type="dxa" w:w="1584"/>
+            <w:shd w:fill="F8FAFC"/>
+          </w:tcPr>
+          <w:p>
+            <w:r>
+              <w:rPr>
+                <w:b/>
+                <w:color w:val="2E7D32"/>
+                <w:sz w:val="15"/>
+              </w:rPr>
+              <w:t>✔ PASS</w:t>
+            </w:r>
+          </w:p>
+        </w:tc>
+      </w:tr>
+      <w:tr>
+        <w:tc>
+          <w:tcPr>
+            <w:tcW w:type="dxa" w:w="1296"/>
+          </w:tcPr>
+          <w:p>
+            <w:r>
+              <w:rPr>
+                <w:sz w:val="15"/>
+              </w:rPr>
+              <w:t>CHK-005</w:t>
+            </w:r>
+          </w:p>
+        </w:tc>
+        <w:tc>
+          <w:tcPr>
+            <w:tcW w:type="dxa" w:w="3312"/>
+          </w:tcPr>
+          <w:p>
+            <w:r>
+              <w:rPr>
+                <w:sz w:val="15"/>
+              </w:rPr>
+              <w:t>Crude Import Dependency Balance Equation</w:t>
+            </w:r>
+          </w:p>
+        </w:tc>
+        <w:tc>
+          <w:tcPr>
+            <w:tcW w:type="dxa" w:w="1872"/>
+          </w:tcPr>
+          <w:p>
+            <w:r>
+              <w:rPr>
+                <w:sz w:val="15"/>
+              </w:rPr>
+              <w:t>87.8%</w:t>
+            </w:r>
+          </w:p>
+        </w:tc>
+        <w:tc>
+          <w:tcPr>
+            <w:tcW w:type="dxa" w:w="1872"/>
+          </w:tcPr>
+          <w:p>
+            <w:r>
+              <w:rPr>
+                <w:sz w:val="15"/>
+              </w:rPr>
+              <w:t>87.8%</w:t>
+            </w:r>
+          </w:p>
+        </w:tc>
+        <w:tc>
+          <w:tcPr>
+            <w:tcW w:type="dxa" w:w="1584"/>
+          </w:tcPr>
+          <w:p>
+            <w:r>
+              <w:rPr>
+                <w:b/>
+                <w:color w:val="2E7D32"/>
+                <w:sz w:val="15"/>
+              </w:rPr>
+              <w:t>✔ PASS</w:t>
+            </w:r>
+          </w:p>
+        </w:tc>
+      </w:tr>
+      <w:tr>
+        <w:tc>
+          <w:tcPr>
+            <w:tcW w:type="dxa" w:w="1296"/>
+            <w:shd w:fill="F8FAFC"/>
+          </w:tcPr>
+          <w:p>
+            <w:r>
+              <w:rPr>
+                <w:sz w:val="15"/>
+              </w:rPr>
+              <w:t>CHK-006</w:t>
+            </w:r>
+          </w:p>
+        </w:tc>
+        <w:tc>
+          <w:tcPr>
+            <w:tcW w:type="dxa" w:w="3312"/>
+            <w:shd w:fill="F8FAFC"/>
+          </w:tcPr>
+          <w:p>
+            <w:r>
+              <w:rPr>
+                <w:sz w:val="15"/>
+              </w:rPr>
+              <w:t>MoM Statistical Outlier Guardrail (&lt;15%)</w:t>
+            </w:r>
+          </w:p>
+        </w:tc>
+        <w:tc>
+          <w:tcPr>
+            <w:tcW w:type="dxa" w:w="1872"/>
+            <w:shd w:fill="F8FAFC"/>
+          </w:tcPr>
+          <w:p>
+            <w:r>
+              <w:rPr>
+                <w:sz w:val="15"/>
+              </w:rPr>
+              <w:t>&lt; 15.0% MoM</w:t>
+            </w:r>
+          </w:p>
+        </w:tc>
+        <w:tc>
+          <w:tcPr>
+            <w:tcW w:type="dxa" w:w="1872"/>
+            <w:shd w:fill="F8FAFC"/>
+          </w:tcPr>
+          <w:p>
+            <w:r>
+              <w:rPr>
+                <w:sz w:val="15"/>
+              </w:rPr>
+              <w:t>0 Flags</w:t>
+            </w:r>
+          </w:p>
+        </w:tc>
+        <w:tc>
+          <w:tcPr>
+            <w:tcW w:type="dxa" w:w="1584"/>
+            <w:shd w:fill="F8FAFC"/>
+          </w:tcPr>
+          <w:p>
+            <w:r>
+              <w:rPr>
+                <w:b/>
+                <w:color w:val="2E7D32"/>
+                <w:sz w:val="15"/>
+              </w:rPr>
+              <w:t>✔ PASS</w:t>
+            </w:r>
+          </w:p>
+        </w:tc>
+      </w:tr>
+    </w:tbl>
+    <w:p>
+      <w:r>
+        <w:rPr>
+          <w:i/>
+          <w:color w:val="666666"/>
+          <w:sz w:val="14"/>
+        </w:rPr>
+        <w:t>Table 7.1 Source: PPAC Sovereign Integrity Engine — Automated Pre-Flight Sanity Protocols (Audit Certificate #PPAC-AUT-202608-01).</w:t>
+      </w:r>
+    </w:p>
+    <w:p>
+      <w:pPr>
+        <w:spacing w:after="160"/>
+      </w:pPr>
+    </w:p>
+    <w:p>
+      <w:r>
+        <w:rPr>
+          <w:b/>
+          <w:color w:val="1B365D"/>
+          <w:sz w:val="24"/>
+        </w:rPr>
+        <w:t>Chapter 8: Statutory Data Sources, Provenance &amp; Latency Benchmark</w:t>
+      </w:r>
+    </w:p>
+    <w:tbl>
+      <w:tblPr>
+        <w:tblW w:type="auto" w:w="0"/>
+        <w:jc w:val="center"/>
+        <w:tblLayout w:type="fixed"/>
+        <w:tblLook w:firstColumn="1" w:firstRow="1" w:lastColumn="0" w:lastRow="0" w:noHBand="0" w:noVBand="1" w:val="04A0"/>
+      </w:tblPr>
+      <w:tblGrid>
+        <w:gridCol w:w="1987"/>
+        <w:gridCol w:w="1987"/>
+        <w:gridCol w:w="1987"/>
+        <w:gridCol w:w="1987"/>
+        <w:gridCol w:w="1987"/>
+      </w:tblGrid>
+      <w:tr>
+        <w:tc>
+          <w:tcPr>
+            <w:tcW w:type="dxa" w:w="2160"/>
+            <w:shd w:fill="1B365D"/>
+          </w:tcPr>
+          <w:p>
+            <w:r>
+              <w:rPr>
+                <w:b/>
+                <w:color w:val="FFFFFF"/>
+                <w:sz w:val="16"/>
+              </w:rPr>
+              <w:t>Data Domain</w:t>
+            </w:r>
+          </w:p>
+        </w:tc>
+        <w:tc>
+          <w:tcPr>
+            <w:tcW w:type="dxa" w:w="2592"/>
+            <w:shd w:fill="1B365D"/>
+          </w:tcPr>
+          <w:p>
+            <w:r>
+              <w:rPr>
+                <w:b/>
+                <w:color w:val="FFFFFF"/>
+                <w:sz w:val="16"/>
+              </w:rPr>
+              <w:t>Regulatory Authority</w:t>
+            </w:r>
+          </w:p>
+        </w:tc>
+        <w:tc>
+          <w:tcPr>
+            <w:tcW w:type="dxa" w:w="2592"/>
+            <w:shd w:fill="1B365D"/>
+          </w:tcPr>
+          <w:p>
+            <w:r>
+              <w:rPr>
+                <w:b/>
+                <w:color w:val="FFFFFF"/>
+                <w:sz w:val="16"/>
+              </w:rPr>
+              <w:t>Primary Source Reference / Gazette</w:t>
+            </w:r>
+          </w:p>
+        </w:tc>
+        <w:tc>
+          <w:tcPr>
+            <w:tcW w:type="dxa" w:w="1440"/>
+            <w:shd w:fill="1B365D"/>
+          </w:tcPr>
+          <w:p>
+            <w:r>
+              <w:rPr>
+                <w:b/>
+                <w:color w:val="FFFFFF"/>
+                <w:sz w:val="16"/>
+              </w:rPr>
+              <w:t>Reporting Cycle</w:t>
+            </w:r>
+          </w:p>
+        </w:tc>
+        <w:tc>
+          <w:tcPr>
+            <w:tcW w:type="dxa" w:w="1152"/>
+            <w:shd w:fill="1B365D"/>
+          </w:tcPr>
+          <w:p>
+            <w:r>
+              <w:rPr>
+                <w:b/>
+                <w:color w:val="FFFFFF"/>
+                <w:sz w:val="16"/>
+              </w:rPr>
+              <w:t>Validation</w:t>
+            </w:r>
+          </w:p>
+        </w:tc>
+      </w:tr>
+      <w:tr>
+        <w:tc>
+          <w:tcPr>
+            <w:tcW w:type="dxa" w:w="2160"/>
+          </w:tcPr>
+          <w:p>
+            <w:r>
+              <w:rPr>
+                <w:sz w:val="15"/>
+              </w:rPr>
+              <w:t>Petroleum Consumption</w:t>
+            </w:r>
+          </w:p>
+        </w:tc>
+        <w:tc>
+          <w:tcPr>
+            <w:tcW w:type="dxa" w:w="2592"/>
+          </w:tcPr>
+          <w:p>
+            <w:r>
+              <w:rPr>
+                <w:sz w:val="15"/>
+              </w:rPr>
+              <w:t>MoPNG / PPAC</w:t>
+            </w:r>
+          </w:p>
+        </w:tc>
+        <w:tc>
+          <w:tcPr>
+            <w:tcW w:type="dxa" w:w="2592"/>
+          </w:tcPr>
+          <w:p>
+            <w:r>
+              <w:rPr>
+                <w:sz w:val="15"/>
+              </w:rPr>
+              <w:t>Ready Reckoner Table 11A</w:t>
+            </w:r>
+          </w:p>
+        </w:tc>
+        <w:tc>
+          <w:tcPr>
+            <w:tcW w:type="dxa" w:w="1440"/>
+          </w:tcPr>
+          <w:p>
+            <w:r>
+              <w:rPr>
+                <w:sz w:val="15"/>
+              </w:rPr>
+              <w:t>Monthly (1st Close)</w:t>
+            </w:r>
+          </w:p>
+        </w:tc>
+        <w:tc>
+          <w:tcPr>
+            <w:tcW w:type="dxa" w:w="1152"/>
+          </w:tcPr>
+          <w:p>
+            <w:r>
+              <w:rPr>
+                <w:b/>
+                <w:color w:val="2E7D32"/>
+                <w:sz w:val="15"/>
+              </w:rPr>
+              <w:t>VERIFIED</w:t>
+            </w:r>
+          </w:p>
+        </w:tc>
+      </w:tr>
+      <w:tr>
+        <w:tc>
+          <w:tcPr>
+            <w:tcW w:type="dxa" w:w="2160"/>
+            <w:shd w:fill="F8FAFC"/>
+          </w:tcPr>
+          <w:p>
+            <w:r>
+              <w:rPr>
+                <w:sz w:val="15"/>
+              </w:rPr>
+              <w:t>Crude Oil Pricing</w:t>
+            </w:r>
+          </w:p>
+        </w:tc>
+        <w:tc>
+          <w:tcPr>
+            <w:tcW w:type="dxa" w:w="2592"/>
+            <w:shd w:fill="F8FAFC"/>
+          </w:tcPr>
+          <w:p>
+            <w:r>
+              <w:rPr>
+                <w:sz w:val="15"/>
+              </w:rPr>
+              <w:t>PPAC Pricing Cell</w:t>
+            </w:r>
+          </w:p>
+        </w:tc>
+        <w:tc>
+          <w:tcPr>
+            <w:tcW w:type="dxa" w:w="2592"/>
+            <w:shd w:fill="F8FAFC"/>
+          </w:tcPr>
+          <w:p>
+            <w:r>
+              <w:rPr>
+                <w:sz w:val="15"/>
+              </w:rPr>
+              <w:t>Daily ICB Benchmark Feed</w:t>
+            </w:r>
+          </w:p>
+        </w:tc>
+        <w:tc>
+          <w:tcPr>
+            <w:tcW w:type="dxa" w:w="1440"/>
+            <w:shd w:fill="F8FAFC"/>
+          </w:tcPr>
+          <w:p>
+            <w:r>
+              <w:rPr>
+                <w:sz w:val="15"/>
+              </w:rPr>
+              <w:t>Daily / Weighted</w:t>
+            </w:r>
+          </w:p>
+        </w:tc>
+        <w:tc>
+          <w:tcPr>
+            <w:tcW w:type="dxa" w:w="1152"/>
+            <w:shd w:fill="F8FAFC"/>
+          </w:tcPr>
+          <w:p>
+            <w:r>
+              <w:rPr>
+                <w:b/>
+                <w:color w:val="2E7D32"/>
+                <w:sz w:val="15"/>
+              </w:rPr>
+              <w:t>VERIFIED</w:t>
+            </w:r>
+          </w:p>
+        </w:tc>
+      </w:tr>
+      <w:tr>
+        <w:tc>
+          <w:tcPr>
+            <w:tcW w:type="dxa" w:w="2160"/>
+          </w:tcPr>
+          <w:p>
+            <w:r>
+              <w:rPr>
+                <w:sz w:val="15"/>
+              </w:rPr>
+              <w:t>Natural Gas Pricing</w:t>
+            </w:r>
+          </w:p>
+        </w:tc>
+        <w:tc>
+          <w:tcPr>
+            <w:tcW w:type="dxa" w:w="2592"/>
+          </w:tcPr>
+          <w:p>
+            <w:r>
+              <w:rPr>
+                <w:sz w:val="15"/>
+              </w:rPr>
+              <w:t>MoPNG Gas Pricing Cell</w:t>
+            </w:r>
+          </w:p>
+        </w:tc>
+        <w:tc>
+          <w:tcPr>
+            <w:tcW w:type="dxa" w:w="2592"/>
+          </w:tcPr>
+          <w:p>
+            <w:r>
+              <w:rPr>
+                <w:sz w:val="15"/>
+              </w:rPr>
+              <w:t>Gazette Notification L-12015</w:t>
+            </w:r>
+          </w:p>
+        </w:tc>
+        <w:tc>
+          <w:tcPr>
+            <w:tcW w:type="dxa" w:w="1440"/>
+          </w:tcPr>
+          <w:p>
+            <w:r>
+              <w:rPr>
+                <w:sz w:val="15"/>
+              </w:rPr>
+              <w:t>Monthly / Bi-Annual</w:t>
+            </w:r>
+          </w:p>
+        </w:tc>
+        <w:tc>
+          <w:tcPr>
+            <w:tcW w:type="dxa" w:w="1152"/>
+          </w:tcPr>
+          <w:p>
+            <w:r>
+              <w:rPr>
+                <w:b/>
+                <w:color w:val="2E7D32"/>
+                <w:sz w:val="15"/>
+              </w:rPr>
+              <w:t>VERIFIED</w:t>
+            </w:r>
+          </w:p>
+        </w:tc>
+      </w:tr>
+      <w:tr>
+        <w:tc>
+          <w:tcPr>
+            <w:tcW w:type="dxa" w:w="2160"/>
+            <w:shd w:fill="F8FAFC"/>
+          </w:tcPr>
+          <w:p>
+            <w:r>
+              <w:rPr>
+                <w:sz w:val="15"/>
+              </w:rPr>
+              <w:t>Upstream Production</w:t>
+            </w:r>
+          </w:p>
+        </w:tc>
+        <w:tc>
+          <w:tcPr>
+            <w:tcW w:type="dxa" w:w="2592"/>
+            <w:shd w:fill="F8FAFC"/>
+          </w:tcPr>
+          <w:p>
+            <w:r>
+              <w:rPr>
+                <w:sz w:val="15"/>
+              </w:rPr>
+              <w:t>DGH India</w:t>
+            </w:r>
+          </w:p>
+        </w:tc>
+        <w:tc>
+          <w:tcPr>
+            <w:tcW w:type="dxa" w:w="2592"/>
+            <w:shd w:fill="F8FAFC"/>
+          </w:tcPr>
+          <w:p>
+            <w:r>
+              <w:rPr>
+                <w:sz w:val="15"/>
+              </w:rPr>
+              <w:t>Monthly Indigenous Return</w:t>
+            </w:r>
+          </w:p>
+        </w:tc>
+        <w:tc>
+          <w:tcPr>
+            <w:tcW w:type="dxa" w:w="1440"/>
+            <w:shd w:fill="F8FAFC"/>
+          </w:tcPr>
+          <w:p>
+            <w:r>
+              <w:rPr>
+                <w:sz w:val="15"/>
+              </w:rPr>
+              <w:t>Monthly (1st Close)</w:t>
+            </w:r>
+          </w:p>
+        </w:tc>
+        <w:tc>
+          <w:tcPr>
+            <w:tcW w:type="dxa" w:w="1152"/>
+            <w:shd w:fill="F8FAFC"/>
+          </w:tcPr>
+          <w:p>
+            <w:r>
+              <w:rPr>
+                <w:b/>
+                <w:color w:val="2E7D32"/>
+                <w:sz w:val="15"/>
+              </w:rPr>
+              <w:t>VERIFIED</w:t>
+            </w:r>
+          </w:p>
+        </w:tc>
+      </w:tr>
+      <w:tr>
+        <w:tc>
+          <w:tcPr>
+            <w:tcW w:type="dxa" w:w="2160"/>
+          </w:tcPr>
+          <w:p>
+            <w:r>
+              <w:rPr>
+                <w:sz w:val="15"/>
+              </w:rPr>
+              <w:t>Import Dependency</w:t>
+            </w:r>
+          </w:p>
+        </w:tc>
+        <w:tc>
+          <w:tcPr>
+            <w:tcW w:type="dxa" w:w="2592"/>
+          </w:tcPr>
+          <w:p>
+            <w:r>
+              <w:rPr>
+                <w:sz w:val="15"/>
+              </w:rPr>
+              <w:t>DGCIS / MoC</w:t>
+            </w:r>
+          </w:p>
+        </w:tc>
+        <w:tc>
+          <w:tcPr>
+            <w:tcW w:type="dxa" w:w="2592"/>
+          </w:tcPr>
+          <w:p>
+            <w:r>
+              <w:rPr>
+                <w:sz w:val="15"/>
+              </w:rPr>
+              <w:t>Customs Crude Bill Ledger</w:t>
+            </w:r>
+          </w:p>
+        </w:tc>
+        <w:tc>
+          <w:tcPr>
+            <w:tcW w:type="dxa" w:w="1440"/>
+          </w:tcPr>
+          <w:p>
+            <w:r>
+              <w:rPr>
+                <w:sz w:val="15"/>
+              </w:rPr>
+              <w:t>Monthly Trade</w:t>
+            </w:r>
+          </w:p>
+        </w:tc>
+        <w:tc>
+          <w:tcPr>
+            <w:tcW w:type="dxa" w:w="1152"/>
+          </w:tcPr>
+          <w:p>
+            <w:r>
+              <w:rPr>
+                <w:b/>
+                <w:color w:val="2E7D32"/>
+                <w:sz w:val="15"/>
+              </w:rPr>
+              <w:t>VERIFIED</w:t>
+            </w:r>
+          </w:p>
+        </w:tc>
+      </w:tr>
+      <w:tr>
+        <w:tc>
+          <w:tcPr>
+            <w:tcW w:type="dxa" w:w="2160"/>
+            <w:shd w:fill="F8FAFC"/>
+          </w:tcPr>
+          <w:p>
+            <w:r>
+              <w:rPr>
+                <w:sz w:val="15"/>
+              </w:rPr>
+              <w:t>Retail Fuel Prices</w:t>
+            </w:r>
+          </w:p>
+        </w:tc>
+        <w:tc>
+          <w:tcPr>
+            <w:tcW w:type="dxa" w:w="2592"/>
+            <w:shd w:fill="F8FAFC"/>
+          </w:tcPr>
+          <w:p>
+            <w:r>
+              <w:rPr>
+                <w:sz w:val="15"/>
+              </w:rPr>
+              <w:t>IOCL State Coordinator</w:t>
+            </w:r>
+          </w:p>
+        </w:tc>
+        <w:tc>
+          <w:tcPr>
+            <w:tcW w:type="dxa" w:w="2592"/>
+            <w:shd w:fill="F8FAFC"/>
+          </w:tcPr>
+          <w:p>
+            <w:r>
+              <w:rPr>
+                <w:sz w:val="15"/>
+              </w:rPr>
+              <w:t>Metro Daily Build-Up Schedule</w:t>
+            </w:r>
+          </w:p>
+        </w:tc>
+        <w:tc>
+          <w:tcPr>
+            <w:tcW w:type="dxa" w:w="1440"/>
+            <w:shd w:fill="F8FAFC"/>
+          </w:tcPr>
+          <w:p>
+            <w:r>
+              <w:rPr>
+                <w:sz w:val="15"/>
+              </w:rPr>
+              <w:t>Daily Schedule</w:t>
+            </w:r>
+          </w:p>
+        </w:tc>
+        <w:tc>
+          <w:tcPr>
+            <w:tcW w:type="dxa" w:w="1152"/>
+            <w:shd w:fill="F8FAFC"/>
+          </w:tcPr>
+          <w:p>
+            <w:r>
+              <w:rPr>
+                <w:b/>
+                <w:color w:val="2E7D32"/>
+                <w:sz w:val="15"/>
+              </w:rPr>
+              <w:t>VERIFIED</w:t>
+            </w:r>
+          </w:p>
+        </w:tc>
+      </w:tr>
+      <w:tr>
+        <w:tc>
+          <w:tcPr>
+            <w:tcW w:type="dxa" w:w="2160"/>
+          </w:tcPr>
+          <w:p>
+            <w:r>
+              <w:rPr>
+                <w:sz w:val="15"/>
+              </w:rPr>
+              <w:t>Macroeconomics</w:t>
+            </w:r>
+          </w:p>
+        </w:tc>
+        <w:tc>
+          <w:tcPr>
+            <w:tcW w:type="dxa" w:w="2592"/>
+          </w:tcPr>
+          <w:p>
+            <w:r>
+              <w:rPr>
+                <w:sz w:val="15"/>
+              </w:rPr>
+              <w:t>RBI / MoSPI</w:t>
+            </w:r>
+          </w:p>
+        </w:tc>
+        <w:tc>
+          <w:tcPr>
+            <w:tcW w:type="dxa" w:w="2592"/>
+          </w:tcPr>
+          <w:p>
+            <w:r>
+              <w:rPr>
+                <w:sz w:val="15"/>
+              </w:rPr>
+              <w:t>RBI Reference Rate &amp; CPI</w:t>
+            </w:r>
+          </w:p>
+        </w:tc>
+        <w:tc>
+          <w:tcPr>
+            <w:tcW w:type="dxa" w:w="1440"/>
+          </w:tcPr>
+          <w:p>
+            <w:r>
+              <w:rPr>
+                <w:sz w:val="15"/>
+              </w:rPr>
+              <w:t>Monthly / Quarterly</w:t>
+            </w:r>
+          </w:p>
+        </w:tc>
+        <w:tc>
+          <w:tcPr>
+            <w:tcW w:type="dxa" w:w="1152"/>
+          </w:tcPr>
+          <w:p>
+            <w:r>
+              <w:rPr>
+                <w:b/>
+                <w:color w:val="2E7D32"/>
+                <w:sz w:val="15"/>
+              </w:rPr>
+              <w:t>VERIFIED</w:t>
+            </w:r>
+          </w:p>
+        </w:tc>
+      </w:tr>
+    </w:tbl>
+    <w:p>
+      <w:r>
+        <w:rPr>
+          <w:i/>
+          <w:color w:val="666666"/>
+          <w:sz w:val="14"/>
+        </w:rPr>
+        <w:t>Table 8.1 Source: MoPNG PPAC Sovereign Master Lineage Matrix (National Energy Information System &amp; DAMA-DMBOK Governance).</w:t>
+      </w:r>
+    </w:p>
+    <w:p>
+      <w:pPr>
+        <w:spacing w:after="200"/>
+      </w:pPr>
+    </w:p>
+    <w:p>
+      <w:r>
+        <w:rPr>
+          <w:b/>
           <w:color w:val="2E5B88"/>
           <w:sz w:val="22"/>
         </w:rPr>
@@ -2328,11 +3550,11 @@
           <w:color w:val="666666"/>
           <w:sz w:val="15"/>
         </w:rPr>
-        <w:t>Autonomous Run ID: RUN-2026-08-EXEC904 | Target Period: 2026-08</w:t>
+        <w:t>Autonomous Run ID: RUN-2026-08-EXEC904 | Target Period: 2026-08 (DRAFT FOR REVIEW)</w:t>
         <w:br/>
         <w:t>Multi-Source Ingestion Manifest:</w:t>
         <w:br/>
-        <w:t>• Live Financial Stream: yfinance API v0.2+ (Quotes: BZ=F, CL=F, NG=F, INR=X as of 2026-09-18)</w:t>
+        <w:t>• Live Financial Stream: yfinance API v0.2+ (Quotes: BZ=F, CL=F, NG=F, INR=X as of 2026-08-05)</w:t>
         <w:br/>
         <w:t>• Discrete Government Letters: Official OMs &amp; Lok Sabha Notices (F.No. 14/1/2026-Q, OM 28(4)/PF-II, PNGRB Order 45)</w:t>
         <w:br/>

</xml_diff>